<commit_message>
docs(f4): redactar discusion sobre limitacion metodologica y variables de confusion (D1)
</commit_message>
<xml_diff>
--- a/docs/f4_s03_grupo6.docx
+++ b/docs/f4_s03_grupo6.docx
@@ -4993,6 +4993,29 @@
         <w:t>El tiempo que un estudiante tarda en titularse es un indicador crítico de eficiencia interna del sistema de educación superior. Identificar qué factores se asocian a las trayectorias de mayor y menor duración no es un simple ejercicio descriptivo, sino que tiene profundas implicaciones de política pública y gestión institucional. Para las autoridades universitarias, comprender las diferencias de duración entre jornadas (diurna, vespertina, a distancia) permite ajustar el diseño de las mallas curriculares, transparentar las expectativas hacia los nuevos estudiantes y focalizar recursos en los programas que concentran los mayores rezagos. Para el Ministerio de Educación y los órganos financiadores (gratuidad, becas), esta evidencia resulta esencial para adecuar los plazos de cobertura de los beneficios estatales a la realidad de las trayectorias efectivas de titulación. El análisis visual que se despliega en las siguientes secciones busca precisamente aportar claridad a estas interrogantes, traduciendo grandes volúmenes de datos en evidencia interpretable para la toma de decisiones.</w:t>
       </w:r>
     </w:p>
+    <w:p>
+      <w:pPr>
+        <w:pStyle w:val="Heading1"/>
+      </w:pPr>
+      <w:r>
+        <w:t>Borrador Fase 4: Discusión y limitaciones (El hallazgo central)</w:t>
+      </w:r>
+    </w:p>
+    <w:p>
+      <w:r>
+        <w:t>El análisis visual de las jornadas revela un contraste estadístico significativo: la jornada a distancia registra una duración mediana de 6 semestres, frente a los 10 semestres de la jornada diurna. Sin embargo, esta diferencia no puede interpretarse como una relación causal donde la «modalidad a distancia» acelere o determine una titulación más rápida.</w:t>
+      </w:r>
+    </w:p>
+    <w:p>
+      <w:r>
+        <w:t>Una limitación metodológica detectada al explorar la composición de los datos es la existencia de una fuerte variable de confusión. Al revisar la variable anio_ing_carr_ori, observamos que un 75,9 % de los registros de titulados a distancia corresponde a datos imputados (sin información sobre su ingreso original), frente a solo un 1,5 % en la jornada diurna. Esto sugiere que la gran mayoría de los estudiantes a distancia presentan trayectorias académicas previas —tales como convalidaciones, carreras previas o programas de continuidad de estudios—. En estos casos, la métrica de duración total de la carrera solo está midiendo el tiempo cursado en el programa final, omitiendo la trayectoria formativa completa.</w:t>
+      </w:r>
+    </w:p>
+    <w:p>
+      <w:r>
+        <w:t>Al recalcular la duración excluyendo los registros imputados, las medianas se mantienen estables (6,0 y 10,0 respectivamente), lo que demuestra que el contraste principal entre jornadas es robusto y defendible. No obstante, el proyecto es de carácter observacional y, ante la presencia de variables no controladas como el historial académico previo, solo es posible afirmar una asociación entre la jornada y la duración reportada, mas no una relación de causalidad. Explicitar esta limitación metodológica y acotar las conclusiones a la evidencia observada dota al análisis de mayor rigor y credibilidad.</w:t>
+      </w:r>
+    </w:p>
     <w:sectPr>
       <w:footerReference w:type="default" r:id="rId9"/>
       <w:pgSz w:w="12240" w:h="15840"/>

</xml_diff>

<commit_message>
docs(f4): agregar bibliografia en formato APA 7ma edicion con fuentes de visualizacion (D4)
</commit_message>
<xml_diff>
--- a/docs/f4_s03_grupo6.docx
+++ b/docs/f4_s03_grupo6.docx
@@ -5016,6 +5016,34 @@
         <w:t>Al recalcular la duración excluyendo los registros imputados, las medianas se mantienen estables (6,0 y 10,0 respectivamente), lo que demuestra que el contraste principal entre jornadas es robusto y defendible. No obstante, el proyecto es de carácter observacional y, ante la presencia de variables no controladas como el historial académico previo, solo es posible afirmar una asociación entre la jornada y la duración reportada, mas no una relación de causalidad. Explicitar esta limitación metodológica y acotar las conclusiones a la evidencia observada dota al análisis de mayor rigor y credibilidad.</w:t>
       </w:r>
     </w:p>
+    <w:p>
+      <w:pPr>
+        <w:pStyle w:val="Heading1"/>
+      </w:pPr>
+      <w:r>
+        <w:t>Borrador Fase 4: Bibliografía (APA 7.ª edición)</w:t>
+      </w:r>
+    </w:p>
+    <w:p>
+      <w:r>
+        <w:t>Centro de Estudios MINEDUC. (2025). Bases de datos de titulados de educación superior 2025. Ministerio de Educación de Chile. https://datosabiertos.mineduc.cl/</w:t>
+      </w:r>
+    </w:p>
+    <w:p>
+      <w:r>
+        <w:t>Cormen, T. H., Leiserson, C. E., Rivest, R. L., &amp; Stein, C. (2022). Introduction to algorithms (4.ª ed.). The MIT Press.</w:t>
+      </w:r>
+    </w:p>
+    <w:p>
+      <w:r>
+        <w:t>McKinney, W. (2022). Python for data analysis: Data wrangling with pandas, NumPy, and Jupyter (3.ª ed.). O'Reilly Media.</w:t>
+      </w:r>
+    </w:p>
+    <w:p>
+      <w:r>
+        <w:t>Universidad Andrés Bello. (2026). MCDI500 – Programación para la Ciencia de Datos: Unidad 3 · Visualización y comunicación de datos [Apunte de clase]. Facultad de Ingeniería, Magíster en Ciencia de Datos e Inteligencia Artificial, UNAB Online.</w:t>
+      </w:r>
+    </w:p>
     <w:sectPr>
       <w:footerReference w:type="default" r:id="rId9"/>
       <w:pgSz w:w="12240" w:h="15840"/>

</xml_diff>